<commit_message>
pagina-einde niet automatisch maar met pagebreak in qmd
</commit_message>
<xml_diff>
--- a/template_hhsk.docx
+++ b/template_hhsk.docx
@@ -32,7 +32,6 @@
       </w:pPr>
       <w:bookmarkStart w:id="0" w:name="project"/>
       <w:r>
-        <w:lastRenderedPageBreak/>
         <w:t>Project</w:t>
       </w:r>
     </w:p>
@@ -248,31 +247,31 @@
       <w:bookmarkEnd w:id="0"/>
       <w:bookmarkEnd w:id="4"/>
       <w:r>
+        <w:t>De restr</w:t>
+      </w:r>
+    </w:p>
+    <w:p>
+      <w:pPr>
+        <w:pStyle w:val="FirstParagraph"/>
+      </w:pPr>
+      <w:r>
+        <w:t>[Keuze 1 – waar ga je aan de slag?] Meerdere keuzes mogelijk</w:t>
+      </w:r>
+    </w:p>
+    <w:p>
+      <w:pPr>
+        <w:pStyle w:val="Plattetekst"/>
+      </w:pPr>
+      <w:r>
+        <w:t>Kaartje met vlakken opnemen</w:t>
+      </w:r>
+    </w:p>
+    <w:p>
+      <w:pPr>
+        <w:pStyle w:val="Plattetekst"/>
+      </w:pPr>
+      <w:r>
         <w:lastRenderedPageBreak/>
-        <w:t>De restr</w:t>
-      </w:r>
-    </w:p>
-    <w:p>
-      <w:pPr>
-        <w:pStyle w:val="FirstParagraph"/>
-      </w:pPr>
-      <w:r>
-        <w:t>[Keuze 1 – waar ga je aan de slag?] Meerdere keuzes mogelijk</w:t>
-      </w:r>
-    </w:p>
-    <w:p>
-      <w:pPr>
-        <w:pStyle w:val="Plattetekst"/>
-      </w:pPr>
-      <w:r>
-        <w:t>Kaartje met vlakken opnemen</w:t>
-      </w:r>
-    </w:p>
-    <w:p>
-      <w:pPr>
-        <w:pStyle w:val="Plattetekst"/>
-      </w:pPr>
-      <w:r>
         <w:t>​​☐​ Schieland Noord</w:t>
       </w:r>
     </w:p>
@@ -449,39 +448,39 @@
         <w:pStyle w:val="Plattetekst"/>
       </w:pPr>
       <w:r>
+        <w:t>Keuze overig: - wat als er iets is dat niet onder de EWP’s valt? Met wie neem je dan contact op? -&gt; hier stopt het formulier</w:t>
+      </w:r>
+    </w:p>
+    <w:p>
+      <w:pPr>
+        <w:pStyle w:val="Plattetekst"/>
+      </w:pPr>
+      <w:r>
+        <w:t>[Keuze 3 – in welke maanden ga je buiten werkzaamheden uitvoeren?]</w:t>
+      </w:r>
+    </w:p>
+    <w:p>
+      <w:pPr>
+        <w:pStyle w:val="Plattetekst"/>
+      </w:pPr>
+      <w:r>
+        <w:t>Begindatum</w:t>
+      </w:r>
+    </w:p>
+    <w:p>
+      <w:pPr>
+        <w:pStyle w:val="Plattetekst"/>
+      </w:pPr>
+      <w:r>
+        <w:t>Einddatum</w:t>
+      </w:r>
+    </w:p>
+    <w:p>
+      <w:pPr>
+        <w:pStyle w:val="Plattetekst"/>
+      </w:pPr>
+      <w:r>
         <w:lastRenderedPageBreak/>
-        <w:t>Keuze overig: - wat als er iets is dat niet onder de EWP’s valt? Met wie neem je dan contact op? -&gt; hier stopt het formulier</w:t>
-      </w:r>
-    </w:p>
-    <w:p>
-      <w:pPr>
-        <w:pStyle w:val="Plattetekst"/>
-      </w:pPr>
-      <w:r>
-        <w:t>[Keuze 3 – in welke maanden ga je buiten werkzaamheden uitvoeren?]</w:t>
-      </w:r>
-    </w:p>
-    <w:p>
-      <w:pPr>
-        <w:pStyle w:val="Plattetekst"/>
-      </w:pPr>
-      <w:r>
-        <w:t>Begindatum</w:t>
-      </w:r>
-    </w:p>
-    <w:p>
-      <w:pPr>
-        <w:pStyle w:val="Plattetekst"/>
-      </w:pPr>
-      <w:r>
-        <w:t>Einddatum</w:t>
-      </w:r>
-    </w:p>
-    <w:p>
-      <w:pPr>
-        <w:pStyle w:val="Plattetekst"/>
-      </w:pPr>
-      <w:r>
         <w:t>Deze keuze kijkt naar de kwetsbare periode van de geselecteerde soorten (de uitkomst van keuze 1 en 2). Dit bepaald welke maatregelen uitgevoerd moeten worden</w:t>
       </w:r>
     </w:p>
@@ -1062,11 +1061,10 @@
     <w:link w:val="Kop1Char"/>
     <w:uiPriority w:val="9"/>
     <w:qFormat/>
-    <w:rsid w:val="00F046AE"/>
+    <w:rsid w:val="0071024C"/>
     <w:pPr>
       <w:keepNext/>
       <w:keepLines/>
-      <w:pageBreakBefore/>
       <w:spacing w:before="360" w:after="80"/>
       <w:outlineLvl w:val="0"/>
     </w:pPr>
@@ -1438,7 +1436,7 @@
     <w:basedOn w:val="Standaardalinea-lettertype"/>
     <w:link w:val="Kop1"/>
     <w:uiPriority w:val="9"/>
-    <w:rsid w:val="00F046AE"/>
+    <w:rsid w:val="0071024C"/>
     <w:rPr>
       <w:rFonts w:asciiTheme="majorHAnsi" w:eastAsiaTheme="majorEastAsia" w:hAnsiTheme="majorHAnsi" w:cstheme="majorBidi"/>
       <w:color w:val="0F4761" w:themeColor="accent1" w:themeShade="BF"/>

</xml_diff>